<commit_message>
Tighten the Emerald AI opening to momentum, overlap and quick intros
Co-Authored-By: Claude Fable 5 <noreply@anthropic.com>
Claude-Session: https://claude.ai/code/session_011Vvxd2V3zerAfjn84yXuuv
</commit_message>
<xml_diff>
--- a/call-scripts/Emerald-AI-F1-Discovery-Call-Script.docx
+++ b/call-scripts/Emerald-AI-F1-Discovery-Call-Script.docx
@@ -63,7 +63,7 @@
         <w:t xml:space="preserve">Call type:</w:t>
       </w:r>
       <w:r>
-        <w:t xml:space="preserve"> First call / discovery, listening-led. Goal: open with the momentum line and the honest goal of the call (we are here to understand, not to sell), introduce yourself and SPORTFIVE in plain words, let Bjorn and George say hello, then hand the floor to them and fill the brief with smart, consultative questions. Agree next steps only if the conversation earns them.</w:t>
+        <w:t xml:space="preserve"> First call / discovery, listening-led. Goal: open with the momentum and the overlap in one breath, keep introductions short, let George and Bjorn say hello, then hand the floor to them: they share as much insight as possible, and together you see if there are any opportunities worth exploring. Fill the brief with smart, consultative questions. Agree next steps only if the conversation earns them.</w:t>
       </w:r>
     </w:p>
     <w:p>
@@ -147,10 +147,10 @@
           <w:b/>
           <w:bCs/>
         </w:rPr>
-        <w:t xml:space="preserve">Opening: the momentum line, the goal of the call, quick intros, hellos from Bjorn and George.</w:t>
-      </w:r>
-      <w:r>
-        <w:t xml:space="preserve"> 3 min</w:t>
+        <w:t xml:space="preserve">Opening: the momentum and the overlap, quick intros, hellos from George and Bjorn.</w:t>
+      </w:r>
+      <w:r>
+        <w:t xml:space="preserve"> 2 min</w:t>
       </w:r>
     </w:p>
     <w:p>
@@ -323,7 +323,7 @@
         <w:t xml:space="preserve">We are here to understand, not to sell.</w:t>
       </w:r>
       <w:r>
-        <w:t xml:space="preserve"> The goal today is not to tell them why Formula 1 is a good fit. It is to find out whether it even makes sense. Say this early and mean it.</w:t>
+        <w:t xml:space="preserve"> The call is for them to share insights, and for both sides to see if there are opportunities worth exploring. Hold that posture the whole way through.</w:t>
       </w:r>
     </w:p>
     <w:p>
@@ -410,7 +410,7 @@
         <w:spacing w:after="60"/>
       </w:pPr>
       <w:r>
-        <w:t xml:space="preserve">Confirm Bjorn and George are ready for a quick hello early in the call</w:t>
+        <w:t xml:space="preserve">Confirm George and Bjorn are ready for a quick hello early in the call</w:t>
       </w:r>
     </w:p>
     <w:p>
@@ -908,7 +908,7 @@
         <w:spacing w:after="160" w:before="360"/>
       </w:pPr>
       <w:r>
-        <w:t xml:space="preserve">Part 1: Opening, the momentum and the goal (3 minutes)</w:t>
+        <w:t xml:space="preserve">Part 1: Opening, momentum and introductions (2 minutes)</w:t>
       </w:r>
     </w:p>
     <w:p>
@@ -923,7 +923,7 @@
           <w:sz w:val="20"/>
           <w:szCs w:val="20"/>
         </w:rPr>
-        <w:t xml:space="preserve">[This opening is deliberately light. The momentum line, the honest goal of the call, short intros, and hellos from Bjorn and George. No homework speech yet; that comes in Part 2, briefly. Confidence here comes from the structure: you know exactly what happens next.]</w:t>
+        <w:t xml:space="preserve">[Short and natural. The momentum line and the overlap line in one breath, quick introductions, hellos from George and Bjorn, then the floor is theirs. No speeches.]</w:t>
       </w:r>
     </w:p>
     <w:p>
@@ -949,7 +949,7 @@
         <w:ind w:left="280" w:right="120"/>
       </w:pPr>
       <w:r>
-        <w:t xml:space="preserve">Let me say upfront why we reached out. We have been seeing all the momentum around Emerald AI, and it felt like it was worth at least having a conversation. And I want to be clear about the goal today: it is not for me to tell you why Formula 1 could be a good fit for you. It is to understand, together, whether it even makes sense. More on that to follow.</w:t>
+        <w:t xml:space="preserve">So, we have been seeing a lot of momentum at Emerald AI, and it felt like it was worthy of at least having a conversation. Because from the outside, there seems to be a lot of overlap: in values, in the customers you serve, and in the ecosystem of partners that Formula 1 gathers. But more on that in a second.</w:t>
       </w:r>
     </w:p>
     <w:p>
@@ -962,7 +962,7 @@
         <w:ind w:left="280" w:right="120"/>
       </w:pPr>
       <w:r>
-        <w:t xml:space="preserve">First, quick introductions from our side."</w:t>
+        <w:t xml:space="preserve">Before we dive into any details, it would be good to quickly do a round of introductions."</w:t>
       </w:r>
     </w:p>
     <w:p>
@@ -971,7 +971,7 @@
         <w:spacing w:after="100" w:before="240"/>
       </w:pPr>
       <w:r>
-        <w:t xml:space="preserve">You, in two sentences</w:t>
+        <w:t xml:space="preserve">You</w:t>
       </w:r>
     </w:p>
     <w:p>
@@ -997,55 +997,7 @@
         <w:ind w:left="280" w:right="120"/>
       </w:pPr>
       <w:r>
-        <w:t xml:space="preserve">And joining me are Bjorn and George, two colleagues I work very closely with in our Formula 1 business."</w:t>
-      </w:r>
-    </w:p>
-    <w:p>
-      <w:pPr>
-        <w:pStyle w:val="Heading3"/>
-        <w:spacing w:after="100" w:before="240"/>
-      </w:pPr>
-      <w:r>
-        <w:t xml:space="preserve">SPORTFIVE, in plain words</w:t>
-      </w:r>
-    </w:p>
-    <w:p>
-      <w:pPr>
-        <w:pBdr>
-          <w:left w:val="single" w:color="1F3864" w:sz="18"/>
-        </w:pBdr>
-        <w:shd w:fill="F2F4F8" w:val="clear"/>
-        <w:spacing w:after="60" w:before="80" w:line="264"/>
-        <w:ind w:left="280" w:right="120"/>
-      </w:pPr>
-      <w:r>
-        <w:t xml:space="preserve">"On SPORTFIVE, very briefly. We are one of the leading sports marketing agencies in the world. We work across the whole world of sports, and the thing we do best is bring sports and brands together. As an agency we hold rights and we are authorized to broker partnerships across a wide range of sports. Formula 1 is one area of expertise, the one the three of us live in day to day, but the access goes well beyond it. And we also have a consultancy arm within the business, where we support brands in building out their overall strategy, in a very data-driven, very methodical way.</w:t>
-      </w:r>
-    </w:p>
-    <w:p>
-      <w:pPr>
-        <w:pBdr>
-          <w:left w:val="single" w:color="1F3864" w:sz="18"/>
-        </w:pBdr>
-        <w:shd w:fill="F2F4F8" w:val="clear"/>
-        <w:spacing w:after="60" w:before="0" w:line="264"/>
-        <w:ind w:left="280" w:right="120"/>
-      </w:pPr>
-      <w:r>
-        <w:t xml:space="preserve">One thing worth knowing for today: our advice costs you nothing. The rights holders pay our fee. So you can use us as a sounding board, freely.</w:t>
-      </w:r>
-    </w:p>
-    <w:p>
-      <w:pPr>
-        <w:pBdr>
-          <w:left w:val="single" w:color="1F3864" w:sz="18"/>
-        </w:pBdr>
-        <w:shd w:fill="F2F4F8" w:val="clear"/>
-        <w:spacing w:after="160" w:before="0" w:line="264"/>
-        <w:ind w:left="280" w:right="120"/>
-      </w:pPr>
-      <w:r>
-        <w:t xml:space="preserve">Bjorn, George, do you want to say a quick hello?"</w:t>
+        <w:t xml:space="preserve">And I have got George and Bjorn on the call as well, two colleagues I work very closely with in our Formula 1 business. Let me hand it over to them to say a quick hello."</w:t>
       </w:r>
     </w:p>
     <w:p>
@@ -1073,7 +1025,7 @@
         <w:ind w:left="280" w:right="120"/>
       </w:pPr>
       <w:r>
-        <w:t xml:space="preserve">"Great. So here is how I would love to run this: you do most of the talking. The more context you can share about Emerald, where the company is and where it is headed, the better our thinking gets. I will ask a few questions along the way, and whatever you are comfortable sharing is helpful."</w:t>
+        <w:t xml:space="preserve">"Great. And the way we would love to use this call: ideally, you share as many insights as you can about Emerald, where the company is and where it is headed, and together we see if there are any potential opportunities to be explored. I will ask a few questions along the way, and whatever you are comfortable sharing is helpful."</w:t>
       </w:r>
     </w:p>
     <w:p>

</xml_diff>

<commit_message>
Rewrite the Emerald AI opening in Rahul's spoken voice, address Jack by name
Co-Authored-By: Claude Fable 5 <noreply@anthropic.com>
Claude-Session: https://claude.ai/code/session_011Vvxd2V3zerAfjn84yXuuv
</commit_message>
<xml_diff>
--- a/call-scripts/Emerald-AI-F1-Discovery-Call-Script.docx
+++ b/call-scripts/Emerald-AI-F1-Discovery-Call-Script.docx
@@ -63,7 +63,7 @@
         <w:t xml:space="preserve">Call type:</w:t>
       </w:r>
       <w:r>
-        <w:t xml:space="preserve"> First call / discovery, listening-led. Goal: open with the momentum and the overlap in one breath, keep introductions short, let George and Bjorn say hello, then hand the floor to them: they share as much insight as possible, and together you see if there are any opportunities worth exploring. Fill the brief with smart, consultative questions. Agree next steps only if the conversation earns them.</w:t>
+        <w:t xml:space="preserve"> First call / discovery, listening-led. Goal: thank Jack, say in a few natural lines why this felt worth exploring, make the goal of the call plain (understand if it makes sense, not sell), give one line on your role, let George and Bjorn say a quick hello, then hand the floor to Jack. Learn as much as you can, answer his questions, and explore together where Emerald could fit. Agree next steps only if the conversation earns them.</w:t>
       </w:r>
     </w:p>
     <w:p>
@@ -147,7 +147,7 @@
           <w:b/>
           <w:bCs/>
         </w:rPr>
-        <w:t xml:space="preserve">Opening: the momentum and the overlap, quick intros, hellos from George and Bjorn.</w:t>
+        <w:t xml:space="preserve">Opening: thank you, why this felt worth exploring, the goal, one line on our role, hellos, then over to Jack.</w:t>
       </w:r>
       <w:r>
         <w:t xml:space="preserve"> 2 min</w:t>
@@ -174,10 +174,10 @@
           <w:b/>
           <w:bCs/>
         </w:rPr>
-        <w:t xml:space="preserve">What we saw from the outside, then the floor is theirs.</w:t>
-      </w:r>
-      <w:r>
-        <w:t xml:space="preserve"> 2 min</w:t>
+        <w:t xml:space="preserve">Jack talks first. Play back the desk research when you need a bridge.</w:t>
+      </w:r>
+      <w:r>
+        <w:t xml:space="preserve"> 3 min</w:t>
       </w:r>
     </w:p>
     <w:p>
@@ -397,7 +397,7 @@
         <w:spacing w:after="60"/>
       </w:pPr>
       <w:r>
-        <w:t xml:space="preserve">[Name] of the Emerald AI contact and pronunciation</w:t>
+        <w:t xml:space="preserve">Jack: confirm full name, role and pronunciation before the call</w:t>
       </w:r>
     </w:p>
     <w:p>
@@ -908,7 +908,7 @@
         <w:spacing w:after="160" w:before="360"/>
       </w:pPr>
       <w:r>
-        <w:t xml:space="preserve">Part 1: Opening, momentum and introductions (2 minutes)</w:t>
+        <w:t xml:space="preserve">Part 1: Opening (2 minutes)</w:t>
       </w:r>
     </w:p>
     <w:p>
@@ -923,7 +923,7 @@
           <w:sz w:val="20"/>
           <w:szCs w:val="20"/>
         </w:rPr>
-        <w:t xml:space="preserve">[Short and natural. The momentum line and the overlap line in one breath, quick introductions, hellos from George and Bjorn, then the floor is theirs. No speeches.]</w:t>
+        <w:t xml:space="preserve">[Say it like you would to a colleague. These lines are the shape, not a script to recite. If a sentence feels too polished in your mouth, rough it up with your own words.]</w:t>
       </w:r>
     </w:p>
     <w:p>
@@ -936,20 +936,33 @@
         <w:ind w:left="280" w:right="120"/>
       </w:pPr>
       <w:r>
-        <w:t xml:space="preserve">"Hi [Name], thank you for making the time. I really appreciate it.</w:t>
-      </w:r>
-    </w:p>
-    <w:p>
-      <w:pPr>
-        <w:pBdr>
-          <w:left w:val="single" w:color="1F3864" w:sz="18"/>
-        </w:pBdr>
-        <w:shd w:fill="F2F4F8" w:val="clear"/>
-        <w:spacing w:after="60" w:before="0" w:line="264"/>
-        <w:ind w:left="280" w:right="120"/>
-      </w:pPr>
-      <w:r>
-        <w:t xml:space="preserve">So, we have been seeing a lot of momentum at Emerald AI, and it felt like it was worthy of at least having a conversation. Because from the outside, there seems to be a lot of overlap: in values, in the customers you serve, and in the ecosystem of partners that Formula 1 gathers. But more on that in a second.</w:t>
+        <w:t xml:space="preserve">"Hi Jack. First and foremost, thank you for your time. We have been looking forward to this one.</w:t>
+      </w:r>
+    </w:p>
+    <w:p>
+      <w:pPr>
+        <w:pBdr>
+          <w:left w:val="single" w:color="1F3864" w:sz="18"/>
+        </w:pBdr>
+        <w:shd w:fill="F2F4F8" w:val="clear"/>
+        <w:spacing w:after="60" w:before="0" w:line="264"/>
+        <w:ind w:left="280" w:right="120"/>
+      </w:pPr>
+      <w:r>
+        <w:t xml:space="preserve">With everything happening at Emerald AI right now, the things you guys are doing, it looks quite exciting. And from the outside, from the desk research we have been doing, it just felt like there was something here worth exploring. A Formula 1 partnership felt worth at least having a conversation about.</w:t>
+      </w:r>
+    </w:p>
+    <w:p>
+      <w:pPr>
+        <w:pBdr>
+          <w:left w:val="single" w:color="1F3864" w:sz="18"/>
+        </w:pBdr>
+        <w:shd w:fill="F2F4F8" w:val="clear"/>
+        <w:spacing w:after="60" w:before="0" w:line="264"/>
+        <w:ind w:left="280" w:right="120"/>
+      </w:pPr>
+      <w:r>
+        <w:t xml:space="preserve">Before we dive in, one thing on the goal today. It is not to tell you why. We would rather use this call to understand if it makes sense at all. So: learn as much as we can about you, answer whatever questions you have, and explore where Emerald AI could fit in what is a complex, but very valuable, ecosystem.</w:t>
       </w:r>
     </w:p>
     <w:p>
@@ -962,42 +975,7 @@
         <w:ind w:left="280" w:right="120"/>
       </w:pPr>
       <w:r>
-        <w:t xml:space="preserve">Before we dive into any details, it would be good to quickly do a round of introductions."</w:t>
-      </w:r>
-    </w:p>
-    <w:p>
-      <w:pPr>
-        <w:pStyle w:val="Heading3"/>
-        <w:spacing w:after="100" w:before="240"/>
-      </w:pPr>
-      <w:r>
-        <w:t xml:space="preserve">You</w:t>
-      </w:r>
-    </w:p>
-    <w:p>
-      <w:pPr>
-        <w:pBdr>
-          <w:left w:val="single" w:color="1F3864" w:sz="18"/>
-        </w:pBdr>
-        <w:shd w:fill="F2F4F8" w:val="clear"/>
-        <w:spacing w:after="60" w:before="80" w:line="264"/>
-        <w:ind w:left="280" w:right="120"/>
-      </w:pPr>
-      <w:r>
-        <w:t xml:space="preserve">"I am based in Germany with SPORTFIVE, and I drive brand partnerships there. Our role, in one line, is to help bring the world of sports and brands together. That is what I do all day.</w:t>
-      </w:r>
-    </w:p>
-    <w:p>
-      <w:pPr>
-        <w:pBdr>
-          <w:left w:val="single" w:color="1F3864" w:sz="18"/>
-        </w:pBdr>
-        <w:shd w:fill="F2F4F8" w:val="clear"/>
-        <w:spacing w:after="160" w:before="0" w:line="264"/>
-        <w:ind w:left="280" w:right="120"/>
-      </w:pPr>
-      <w:r>
-        <w:t xml:space="preserve">And I have got George and Bjorn on the call as well, two colleagues I work very closely with in our Formula 1 business. Let me hand it over to them to say a quick hello."</w:t>
+        <w:t xml:space="preserve">So, enough from me. Our role here, the three of us, is to help drive strategic brand partnerships, bringing the world of motorsport and brands together. Let me hand it over to George and Bjorn to say a quick hello."</w:t>
       </w:r>
     </w:p>
     <w:p>
@@ -1012,7 +990,7 @@
           <w:sz w:val="20"/>
           <w:szCs w:val="20"/>
         </w:rPr>
-        <w:t xml:space="preserve">[Hand over. Let them each say two or three warm sentences, no pitching. Then take the floor back:]</w:t>
+        <w:t xml:space="preserve">[George and Bjorn say hello. Two or three sentences each, no pitching. Then:]</w:t>
       </w:r>
     </w:p>
     <w:p>
@@ -1025,7 +1003,7 @@
         <w:ind w:left="280" w:right="120"/>
       </w:pPr>
       <w:r>
-        <w:t xml:space="preserve">"Great. And the way we would love to use this call: ideally, you share as many insights as you can about Emerald, where the company is and where it is headed, and together we see if there are any potential opportunities to be explored. I will ask a few questions along the way, and whatever you are comfortable sharing is helpful."</w:t>
+        <w:t xml:space="preserve">"Great. And with that, Jack, over to you. Tell us about Emerald, as much as you want to share. Where the company is, where it is headed. We will take the conversation from there."</w:t>
       </w:r>
     </w:p>
     <w:p>
@@ -1034,7 +1012,7 @@
         <w:spacing w:after="160" w:before="360"/>
       </w:pPr>
       <w:r>
-        <w:t xml:space="preserve">Part 2: What we saw from the outside (2 minutes)</w:t>
+        <w:t xml:space="preserve">Part 2: Jack talks first, then the playback (3 minutes)</w:t>
       </w:r>
     </w:p>
     <w:p>
@@ -1049,7 +1027,7 @@
           <w:sz w:val="20"/>
           <w:szCs w:val="20"/>
         </w:rPr>
-        <w:t xml:space="preserve">[A short homework beat. Three sentences that prove you did the reading, then the check question, then the floor is theirs. Do not lecture them about their own company.]</w:t>
+        <w:t xml:space="preserve">[Jack talks. Listen, take notes, do not jump in with the sport. When he winds down, or if he asks what your research showed, bridge with the playback:]</w:t>
       </w:r>
     </w:p>
     <w:p>
@@ -1062,7 +1040,7 @@
         <w:ind w:left="280" w:right="120"/>
       </w:pPr>
       <w:r>
-        <w:t xml:space="preserve">"Before I hand it over, let me quickly play back what we saw from the outside, and you can tell me where we are wrong.</w:t>
+        <w:t xml:space="preserve">"Really useful, thank you. Let me quickly play back what we had seen from the outside before this call, and you tell me where we got it wrong.</w:t>
       </w:r>
     </w:p>
     <w:p>
@@ -1088,7 +1066,7 @@
         <w:ind w:left="280" w:right="120"/>
       </w:pPr>
       <w:r>
-        <w:t xml:space="preserve">That pace, and that story, is why we called. Did we get it roughly right?"</w:t>
+        <w:t xml:space="preserve">Did we get it roughly right?"</w:t>
       </w:r>
     </w:p>
     <w:p>
@@ -1103,7 +1081,7 @@
           <w:sz w:val="20"/>
           <w:szCs w:val="20"/>
         </w:rPr>
-        <w:t xml:space="preserve">[Let them react. Their correction is the first discovery answer. Then open softly:]</w:t>
+        <w:t xml:space="preserve">[Their correction is discovery gold. Then:]</w:t>
       </w:r>
     </w:p>
     <w:p>
@@ -1116,7 +1094,7 @@
         <w:ind w:left="280" w:right="120"/>
       </w:pPr>
       <w:r>
-        <w:t xml:space="preserve">"So let me start properly. How much do you follow Formula 1, if at all? And has Emerald thought about sport, or marketing of this kind, before?"</w:t>
+        <w:t xml:space="preserve">"And before I get into my questions: how much do you follow Formula 1, if at all? Has Emerald looked at sport, or anything like it, before?"</w:t>
       </w:r>
     </w:p>
     <w:p>
@@ -3164,7 +3142,7 @@
         <w:ind w:left="280" w:right="120"/>
       </w:pPr>
       <w:r>
-        <w:t xml:space="preserve">"[Name], this was exactly the conversation we hoped for. Thank you. Let me close with what happens next, so there are no surprises.</w:t>
+        <w:t xml:space="preserve">"Jack, this was exactly the conversation we hoped for. Thank you. Let me close with what happens next, so there are no surprises.</w:t>
       </w:r>
     </w:p>
     <w:p>
@@ -3270,7 +3248,7 @@
         <w:ind w:left="280" w:right="120"/>
       </w:pPr>
       <w:r>
-        <w:t xml:space="preserve">"Thank you, [Name]. You will hear from me by [date]. Whatever the answer turns out to be, I am glad we had this conversation."</w:t>
+        <w:t xml:space="preserve">"Thank you, Jack. You will hear from me by [date]. Whatever the answer turns out to be, I am glad we had this conversation."</w:t>
       </w:r>
     </w:p>
     <w:p>

</xml_diff>

<commit_message>
Shorten the Emerald AI opening to four quick beats
Co-Authored-By: Claude Fable 5 <noreply@anthropic.com>
Claude-Session: https://claude.ai/code/session_011Vvxd2V3zerAfjn84yXuuv
</commit_message>
<xml_diff>
--- a/call-scripts/Emerald-AI-F1-Discovery-Call-Script.docx
+++ b/call-scripts/Emerald-AI-F1-Discovery-Call-Script.docx
@@ -147,10 +147,10 @@
           <w:b/>
           <w:bCs/>
         </w:rPr>
-        <w:t xml:space="preserve">Opening: thank you, why this felt worth exploring, the goal, one line on our role, hellos, then over to Jack.</w:t>
-      </w:r>
-      <w:r>
-        <w:t xml:space="preserve"> 2 min</w:t>
+        <w:t xml:space="preserve">Opening: thank you, why we called, the goal, one line on our role, hellos, then over to Jack.</w:t>
+      </w:r>
+      <w:r>
+        <w:t xml:space="preserve"> 1 min</w:t>
       </w:r>
     </w:p>
     <w:p>
@@ -908,7 +908,7 @@
         <w:spacing w:after="160" w:before="360"/>
       </w:pPr>
       <w:r>
-        <w:t xml:space="preserve">Part 1: Opening (2 minutes)</w:t>
+        <w:t xml:space="preserve">Part 1: Opening (1 minute)</w:t>
       </w:r>
     </w:p>
     <w:p>
@@ -923,7 +923,7 @@
           <w:sz w:val="20"/>
           <w:szCs w:val="20"/>
         </w:rPr>
-        <w:t xml:space="preserve">[Say it like you would to a colleague. These lines are the shape, not a script to recite. If a sentence feels too polished in your mouth, rough it up with your own words.]</w:t>
+        <w:t xml:space="preserve">[Four short beats, said like you talk. If a line feels polished in your mouth, rough it up.]</w:t>
       </w:r>
     </w:p>
     <w:p>
@@ -936,33 +936,33 @@
         <w:ind w:left="280" w:right="120"/>
       </w:pPr>
       <w:r>
-        <w:t xml:space="preserve">"Hi Jack. First and foremost, thank you for your time. We have been looking forward to this one.</w:t>
-      </w:r>
-    </w:p>
-    <w:p>
-      <w:pPr>
-        <w:pBdr>
-          <w:left w:val="single" w:color="1F3864" w:sz="18"/>
-        </w:pBdr>
-        <w:shd w:fill="F2F4F8" w:val="clear"/>
-        <w:spacing w:after="60" w:before="0" w:line="264"/>
-        <w:ind w:left="280" w:right="120"/>
-      </w:pPr>
-      <w:r>
-        <w:t xml:space="preserve">With everything happening at Emerald AI right now, the things you guys are doing, it looks quite exciting. And from the outside, from the desk research we have been doing, it just felt like there was something here worth exploring. A Formula 1 partnership felt worth at least having a conversation about.</w:t>
-      </w:r>
-    </w:p>
-    <w:p>
-      <w:pPr>
-        <w:pBdr>
-          <w:left w:val="single" w:color="1F3864" w:sz="18"/>
-        </w:pBdr>
-        <w:shd w:fill="F2F4F8" w:val="clear"/>
-        <w:spacing w:after="60" w:before="0" w:line="264"/>
-        <w:ind w:left="280" w:right="120"/>
-      </w:pPr>
-      <w:r>
-        <w:t xml:space="preserve">Before we dive in, one thing on the goal today. It is not to tell you why. We would rather use this call to understand if it makes sense at all. So: learn as much as we can about you, answer whatever questions you have, and explore where Emerald AI could fit in what is a complex, but very valuable, ecosystem.</w:t>
+        <w:t xml:space="preserve">"Hi Jack, thank you for the time. We have been looking forward to this one.</w:t>
+      </w:r>
+    </w:p>
+    <w:p>
+      <w:pPr>
+        <w:pBdr>
+          <w:left w:val="single" w:color="1F3864" w:sz="18"/>
+        </w:pBdr>
+        <w:shd w:fill="F2F4F8" w:val="clear"/>
+        <w:spacing w:after="60" w:before="0" w:line="264"/>
+        <w:ind w:left="280" w:right="120"/>
+      </w:pPr>
+      <w:r>
+        <w:t xml:space="preserve">The reason for the call is simple. What you guys are building looks exciting, and from the desk research we have done, a Formula 1 partnership felt at least worth a conversation.</w:t>
+      </w:r>
+    </w:p>
+    <w:p>
+      <w:pPr>
+        <w:pBdr>
+          <w:left w:val="single" w:color="1F3864" w:sz="18"/>
+        </w:pBdr>
+        <w:shd w:fill="F2F4F8" w:val="clear"/>
+        <w:spacing w:after="60" w:before="0" w:line="264"/>
+        <w:ind w:left="280" w:right="120"/>
+      </w:pPr>
+      <w:r>
+        <w:t xml:space="preserve">And the goal today is not to tell you why. It is to figure out, together, if it makes sense at all. We learn about you, you ask us anything, and we see where Emerald could fit.</w:t>
       </w:r>
     </w:p>
     <w:p>
@@ -975,7 +975,7 @@
         <w:ind w:left="280" w:right="120"/>
       </w:pPr>
       <w:r>
-        <w:t xml:space="preserve">So, enough from me. Our role here, the three of us, is to help drive strategic brand partnerships, bringing the world of motorsport and brands together. Let me hand it over to George and Bjorn to say a quick hello."</w:t>
+        <w:t xml:space="preserve">That is it from me. The three of us drive brand partnerships here, bringing the world of motorsport and brands together. George, Bjorn, quick hello?"</w:t>
       </w:r>
     </w:p>
     <w:p>
@@ -1003,7 +1003,7 @@
         <w:ind w:left="280" w:right="120"/>
       </w:pPr>
       <w:r>
-        <w:t xml:space="preserve">"Great. And with that, Jack, over to you. Tell us about Emerald, as much as you want to share. Where the company is, where it is headed. We will take the conversation from there."</w:t>
+        <w:t xml:space="preserve">"Great. Jack, over to you. Where is the company, and where is it headed? We will take it from there."</w:t>
       </w:r>
     </w:p>
     <w:p>

</xml_diff>

<commit_message>
Add ready answers for what caught our eye and where Emerald fits
Co-Authored-By: Claude Fable 5 <noreply@anthropic.com>
Claude-Session: https://claude.ai/code/session_011Vvxd2V3zerAfjn84yXuuv
</commit_message>
<xml_diff>
--- a/call-scripts/Emerald-AI-F1-Discovery-Call-Script.docx
+++ b/call-scripts/Emerald-AI-F1-Discovery-Call-Script.docx
@@ -1027,7 +1027,131 @@
           <w:sz w:val="20"/>
           <w:szCs w:val="20"/>
         </w:rPr>
-        <w:t xml:space="preserve">[Jack talks. Listen, take notes, do not jump in with the sport. When he winds down, or if he asks what your research showed, bridge with the playback:]</w:t>
+        <w:t xml:space="preserve">[Two questions Jack may fire back the moment you hand over. Answer short, then give him the floor again.]</w:t>
+      </w:r>
+    </w:p>
+    <w:p>
+      <w:pPr>
+        <w:pStyle w:val="Heading3"/>
+        <w:spacing w:after="100" w:before="240"/>
+      </w:pPr>
+      <w:r>
+        <w:t xml:space="preserve">If he asks: "What about Emerald caught your eye?"</w:t>
+      </w:r>
+    </w:p>
+    <w:p>
+      <w:pPr>
+        <w:pBdr>
+          <w:left w:val="single" w:color="1F3864" w:sz="18"/>
+        </w:pBdr>
+        <w:shd w:fill="F2F4F8" w:val="clear"/>
+        <w:spacing w:after="60" w:before="80" w:line="264"/>
+        <w:ind w:left="280" w:right="120"/>
+      </w:pPr>
+      <w:r>
+        <w:t xml:space="preserve">"Three things, all from the outside, so correct me where we are off.</w:t>
+      </w:r>
+    </w:p>
+    <w:p>
+      <w:pPr>
+        <w:pBdr>
+          <w:left w:val="single" w:color="1F3864" w:sz="18"/>
+        </w:pBdr>
+        <w:shd w:fill="F2F4F8" w:val="clear"/>
+        <w:spacing w:after="60" w:before="0" w:line="264"/>
+        <w:ind w:left="280" w:right="120"/>
+      </w:pPr>
+      <w:r>
+        <w:t xml:space="preserve">The pace. You came out of stealth last summer, and a year later you are a unicorn with NVIDIA, Siemens and RWE on the investor list. That does not happen to ordinary companies.</w:t>
+      </w:r>
+    </w:p>
+    <w:p>
+      <w:pPr>
+        <w:pBdr>
+          <w:left w:val="single" w:color="1F3864" w:sz="18"/>
+        </w:pBdr>
+        <w:shd w:fill="F2F4F8" w:val="clear"/>
+        <w:spacing w:after="60" w:before="0" w:line="264"/>
+        <w:ind w:left="280" w:right="120"/>
+      </w:pPr>
+      <w:r>
+        <w:t xml:space="preserve">The problem you picked. The whole world is racing to build AI, and the real bottleneck is power. You went after the bottleneck itself: software that lets data centers ease off when the grid is stressed, so more AI can connect to the same grid, faster. Picking the unglamorous problem everyone else is stuck behind, that caught our eye.</w:t>
+      </w:r>
+    </w:p>
+    <w:p>
+      <w:pPr>
+        <w:pBdr>
+          <w:left w:val="single" w:color="1F3864" w:sz="18"/>
+        </w:pBdr>
+        <w:shd w:fill="F2F4F8" w:val="clear"/>
+        <w:spacing w:after="160" w:before="0" w:line="264"/>
+        <w:ind w:left="280" w:right="120"/>
+      </w:pPr>
+      <w:r>
+        <w:t xml:space="preserve">And the overlap. Formula 1 is a competition about squeezing more performance out of limited energy and limited computing. That is basically your pitch, at racing speed. When a company's story and the sport's story sit this close together, we pick up the phone."</w:t>
+      </w:r>
+    </w:p>
+    <w:p>
+      <w:pPr>
+        <w:pStyle w:val="Heading3"/>
+        <w:spacing w:after="100" w:before="240"/>
+      </w:pPr>
+      <w:r>
+        <w:t xml:space="preserve">If he asks: "And where do you see us fitting?"</w:t>
+      </w:r>
+    </w:p>
+    <w:p>
+      <w:pPr>
+        <w:pBdr>
+          <w:left w:val="single" w:color="1F3864" w:sz="18"/>
+        </w:pBdr>
+        <w:shd w:fill="F2F4F8" w:val="clear"/>
+        <w:spacing w:after="60" w:before="80" w:line="264"/>
+        <w:ind w:left="280" w:right="120"/>
+      </w:pPr>
+      <w:r>
+        <w:t xml:space="preserve">"Straight answer: I have a hypothesis, not a recommendation. Getting from one to the other is what this call is for.</w:t>
+      </w:r>
+    </w:p>
+    <w:p>
+      <w:pPr>
+        <w:pBdr>
+          <w:left w:val="single" w:color="1F3864" w:sz="18"/>
+        </w:pBdr>
+        <w:shd w:fill="F2F4F8" w:val="clear"/>
+        <w:spacing w:after="60" w:before="0" w:line="264"/>
+        <w:ind w:left="280" w:right="120"/>
+      </w:pPr>
+      <w:r>
+        <w:t xml:space="preserve">The shape I would explore first is the right-sized one. The sport's own energy story is huge right now: new rules in 2026, sustainable fuel, a Net Zero commitment. A company that makes power grids smarter sits naturally inside that story. So I would look at sharp content built on that overlap, hospitality that puts your buyers, the utilities, the data center operators, the AI companies, in one room at a race, and only then, if the story earns it, an entry-level seat with a team.</w:t>
+      </w:r>
+    </w:p>
+    <w:p>
+      <w:pPr>
+        <w:pBdr>
+          <w:left w:val="single" w:color="1F3864" w:sz="18"/>
+        </w:pBdr>
+        <w:shd w:fill="F2F4F8" w:val="clear"/>
+        <w:spacing w:after="160" w:before="0" w:line="264"/>
+        <w:ind w:left="280" w:right="120"/>
+      </w:pPr>
+      <w:r>
+        <w:t xml:space="preserve">But which door, and at what size, that depends on what you tell me in the next half hour. Give me the context, and we come back with options sized for where Emerald is today. And if the honest answer is that none of it fits yet, we will say that too."</w:t>
+      </w:r>
+    </w:p>
+    <w:p>
+      <w:pPr>
+        <w:spacing w:after="100" w:before="60"/>
+      </w:pPr>
+      <w:r>
+        <w:rPr>
+          <w:i/>
+          <w:iCs/>
+          <w:color w:val="595959"/>
+          <w:sz w:val="20"/>
+          <w:szCs w:val="20"/>
+        </w:rPr>
+        <w:t xml:space="preserve">[Otherwise: Jack talks. Listen, take notes, do not jump in with the sport. When he winds down, or if he asks what your research showed, bridge with the playback:]</w:t>
       </w:r>
     </w:p>
     <w:p>

</xml_diff>

<commit_message>
Loosen the two ready answers into a spoken, conversational voice
Co-Authored-By: Claude Fable 5 <noreply@anthropic.com>
Claude-Session: https://claude.ai/code/session_011Vvxd2V3zerAfjn84yXuuv
</commit_message>
<xml_diff>
--- a/call-scripts/Emerald-AI-F1-Discovery-Call-Script.docx
+++ b/call-scripts/Emerald-AI-F1-Discovery-Call-Script.docx
@@ -1049,33 +1049,33 @@
         <w:ind w:left="280" w:right="120"/>
       </w:pPr>
       <w:r>
-        <w:t xml:space="preserve">"Three things, all from the outside, so correct me where we are off.</w:t>
-      </w:r>
-    </w:p>
-    <w:p>
-      <w:pPr>
-        <w:pBdr>
-          <w:left w:val="single" w:color="1F3864" w:sz="18"/>
-        </w:pBdr>
-        <w:shd w:fill="F2F4F8" w:val="clear"/>
-        <w:spacing w:after="60" w:before="0" w:line="264"/>
-        <w:ind w:left="280" w:right="120"/>
-      </w:pPr>
-      <w:r>
-        <w:t xml:space="preserve">The pace. You came out of stealth last summer, and a year later you are a unicorn with NVIDIA, Siemens and RWE on the investor list. That does not happen to ordinary companies.</w:t>
-      </w:r>
-    </w:p>
-    <w:p>
-      <w:pPr>
-        <w:pBdr>
-          <w:left w:val="single" w:color="1F3864" w:sz="18"/>
-        </w:pBdr>
-        <w:shd w:fill="F2F4F8" w:val="clear"/>
-        <w:spacing w:after="60" w:before="0" w:line="264"/>
-        <w:ind w:left="280" w:right="120"/>
-      </w:pPr>
-      <w:r>
-        <w:t xml:space="preserve">The problem you picked. The whole world is racing to build AI, and the real bottleneck is power. You went after the bottleneck itself: software that lets data centers ease off when the grid is stressed, so more AI can connect to the same grid, faster. Picking the unglamorous problem everyone else is stuck behind, that caught our eye.</w:t>
+        <w:t xml:space="preserve">"A few things, truthfully.</w:t>
+      </w:r>
+    </w:p>
+    <w:p>
+      <w:pPr>
+        <w:pBdr>
+          <w:left w:val="single" w:color="1F3864" w:sz="18"/>
+        </w:pBdr>
+        <w:shd w:fill="F2F4F8" w:val="clear"/>
+        <w:spacing w:after="60" w:before="0" w:line="264"/>
+        <w:ind w:left="280" w:right="120"/>
+      </w:pPr>
+      <w:r>
+        <w:t xml:space="preserve">First, you're hard to miss right now. A company that comes out of stealth and is a unicorn a year later, with NVIDIA, Siemens and RWE behind it, that gets our attention like everyone else's.</w:t>
+      </w:r>
+    </w:p>
+    <w:p>
+      <w:pPr>
+        <w:pBdr>
+          <w:left w:val="single" w:color="1F3864" w:sz="18"/>
+        </w:pBdr>
+        <w:shd w:fill="F2F4F8" w:val="clear"/>
+        <w:spacing w:after="60" w:before="0" w:line="264"/>
+        <w:ind w:left="280" w:right="120"/>
+      </w:pPr>
+      <w:r>
+        <w:t xml:space="preserve">But the thing that stuck with me is the problem you went after. Everyone is building AI. You looked at it and said: the real problem is power. And instead of pouring more concrete, you built software that makes the grid we already have go further. That's a clever place to stand.</w:t>
       </w:r>
     </w:p>
     <w:p>
@@ -1088,7 +1088,7 @@
         <w:ind w:left="280" w:right="120"/>
       </w:pPr>
       <w:r>
-        <w:t xml:space="preserve">And the overlap. Formula 1 is a competition about squeezing more performance out of limited energy and limited computing. That is basically your pitch, at racing speed. When a company's story and the sport's story sit this close together, we pick up the phone."</w:t>
+        <w:t xml:space="preserve">And then, I'll admit, the F1 brain in me switched on. Because this whole sport runs on the same idea. Same fuel for everyone, a budget cap, even a cap on computing. You win by squeezing more out of the same. I read about Emerald and thought, hang on, that's the same story. That's why I called."</w:t>
       </w:r>
     </w:p>
     <w:p>
@@ -1110,20 +1110,20 @@
         <w:ind w:left="280" w:right="120"/>
       </w:pPr>
       <w:r>
-        <w:t xml:space="preserve">"Straight answer: I have a hypothesis, not a recommendation. Getting from one to the other is what this call is for.</w:t>
-      </w:r>
-    </w:p>
-    <w:p>
-      <w:pPr>
-        <w:pBdr>
-          <w:left w:val="single" w:color="1F3864" w:sz="18"/>
-        </w:pBdr>
-        <w:shd w:fill="F2F4F8" w:val="clear"/>
-        <w:spacing w:after="60" w:before="0" w:line="264"/>
-        <w:ind w:left="280" w:right="120"/>
-      </w:pPr>
-      <w:r>
-        <w:t xml:space="preserve">The shape I would explore first is the right-sized one. The sport's own energy story is huge right now: new rules in 2026, sustainable fuel, a Net Zero commitment. A company that makes power grids smarter sits naturally inside that story. So I would look at sharp content built on that overlap, hospitality that puts your buyers, the utilities, the data center operators, the AI companies, in one room at a race, and only then, if the story earns it, an entry-level seat with a team.</w:t>
+        <w:t xml:space="preserve">"Honest answer? I don't know yet. I have a feeling, not a recommendation, and I'd be guessing if I gave you one now.</w:t>
+      </w:r>
+    </w:p>
+    <w:p>
+      <w:pPr>
+        <w:pBdr>
+          <w:left w:val="single" w:color="1F3864" w:sz="18"/>
+        </w:pBdr>
+        <w:shd w:fill="F2F4F8" w:val="clear"/>
+        <w:spacing w:after="60" w:before="0" w:line="264"/>
+        <w:ind w:left="280" w:right="120"/>
+      </w:pPr>
+      <w:r>
+        <w:t xml:space="preserve">But I'll share the feeling. This sport has a big energy story at the moment: new rules next year, sustainable fuel, a Net Zero promise. And here comes a company that makes power grids smarter. Those two belong in the same sentence. So my first instinct isn't a big logo deal. It's the smart, right-sized stuff: content built on that energy story, getting your buyers, the utilities, the data center folks, into a paddock for a weekend. And if that works, maybe an entry seat with a team down the line.</w:t>
       </w:r>
     </w:p>
     <w:p>
@@ -1136,7 +1136,7 @@
         <w:ind w:left="280" w:right="120"/>
       </w:pPr>
       <w:r>
-        <w:t xml:space="preserve">But which door, and at what size, that depends on what you tell me in the next half hour. Give me the context, and we come back with options sized for where Emerald is today. And if the honest answer is that none of it fits yet, we will say that too."</w:t>
+        <w:t xml:space="preserve">But that's me after desk research. You know the company. So tell me about Emerald, and by the end of this call I'll have a much better answer for you. And if the real answer turns out to be 'not yet', I'll tell you that too."</w:t>
       </w:r>
     </w:p>
     <w:p>

</xml_diff>